<commit_message>
Cover the new rules and document the changed flow
Also relaxes the consolidation count check: a forced record that has already
been captured in a source set is copied like any other entry, and saveRecord
then updates it rather than adding a second, so the total is not always the
copied rows plus the forced ones.

Co-authored-by: paladuguraj <paladuguraj@users.noreply.github.com>
</commit_message>
<xml_diff>
--- a/docs/CSAT Survey Portal - Functional Requirements and Test Report.docx
+++ b/docs/CSAT Survey Portal - Functional Requirements and Test Report.docx
@@ -28,7 +28,7 @@
         </w:p>
       </w:sdtContent>
     </w:sdt>
-    <w:bookmarkStart w:id="40" w:name="X5b5e0d4201f25ea5647317961a6b8e350744058"/>
+    <w:bookmarkStart w:id="41" w:name="X5b5e0d4201f25ea5647317961a6b8e350744058"/>
     <w:p>
       <w:pPr>
         <w:pStyle w:val="Heading1"/>
@@ -1579,6 +1579,267 @@
           </w:p>
         </w:tc>
       </w:tr>
+      <w:tr>
+        <w:tc>
+          <w:tcPr/>
+          <w:p>
+            <w:pPr>
+              <w:pStyle w:val="Compact"/>
+              <w:jc w:val="left"/>
+            </w:pPr>
+            <w:r>
+              <w:t xml:space="preserve">FR-30</w:t>
+            </w:r>
+          </w:p>
+        </w:tc>
+        <w:tc>
+          <w:tcPr/>
+          <w:p>
+            <w:pPr>
+              <w:pStyle w:val="Compact"/>
+              <w:jc w:val="left"/>
+            </w:pPr>
+            <w:r>
+              <w:t xml:space="preserve">Recipients are</w:t>
+            </w:r>
+            <w:r>
+              <w:t xml:space="preserve"> </w:t>
+            </w:r>
+            <w:r>
+              <w:rPr>
+                <w:bCs/>
+                <w:b/>
+              </w:rPr>
+              <w:t xml:space="preserve">checkboxes</w:t>
+            </w:r>
+            <w:r>
+              <w:t xml:space="preserve">, so one request can go to the contact and named users</w:t>
+            </w:r>
+          </w:p>
+        </w:tc>
+        <w:tc>
+          <w:tcPr/>
+          <w:p>
+            <w:pPr>
+              <w:pStyle w:val="Compact"/>
+              <w:jc w:val="left"/>
+            </w:pPr>
+            <w:r>
+              <w:t xml:space="preserve">Met</w:t>
+            </w:r>
+          </w:p>
+        </w:tc>
+      </w:tr>
+      <w:tr>
+        <w:tc>
+          <w:tcPr/>
+          <w:p>
+            <w:pPr>
+              <w:pStyle w:val="Compact"/>
+              <w:jc w:val="left"/>
+            </w:pPr>
+            <w:r>
+              <w:t xml:space="preserve">FR-31</w:t>
+            </w:r>
+          </w:p>
+        </w:tc>
+        <w:tc>
+          <w:tcPr/>
+          <w:p>
+            <w:pPr>
+              <w:pStyle w:val="Compact"/>
+              <w:jc w:val="left"/>
+            </w:pPr>
+            <w:r>
+              <w:t xml:space="preserve">The</w:t>
+            </w:r>
+            <w:r>
+              <w:t xml:space="preserve"> </w:t>
+            </w:r>
+            <w:r>
+              <w:rPr>
+                <w:bCs/>
+                <w:b/>
+              </w:rPr>
+              <w:t xml:space="preserve">90-day limit runs per survey</w:t>
+            </w:r>
+            <w:r>
+              <w:t xml:space="preserve">, not across the portal</w:t>
+            </w:r>
+          </w:p>
+        </w:tc>
+        <w:tc>
+          <w:tcPr/>
+          <w:p>
+            <w:pPr>
+              <w:pStyle w:val="Compact"/>
+              <w:jc w:val="left"/>
+            </w:pPr>
+            <w:r>
+              <w:t xml:space="preserve">Met</w:t>
+            </w:r>
+          </w:p>
+        </w:tc>
+      </w:tr>
+      <w:tr>
+        <w:tc>
+          <w:tcPr/>
+          <w:p>
+            <w:pPr>
+              <w:pStyle w:val="Compact"/>
+              <w:jc w:val="left"/>
+            </w:pPr>
+            <w:r>
+              <w:t xml:space="preserve">FR-32</w:t>
+            </w:r>
+          </w:p>
+        </w:tc>
+        <w:tc>
+          <w:tcPr/>
+          <w:p>
+            <w:pPr>
+              <w:pStyle w:val="Compact"/>
+              <w:jc w:val="left"/>
+            </w:pPr>
+            <w:r>
+              <w:t xml:space="preserve">The survey is chosen</w:t>
+            </w:r>
+            <w:r>
+              <w:t xml:space="preserve"> </w:t>
+            </w:r>
+            <w:r>
+              <w:rPr>
+                <w:bCs/>
+                <w:b/>
+              </w:rPr>
+              <w:t xml:space="preserve">first</w:t>
+            </w:r>
+            <w:r>
+              <w:t xml:space="preserve">, and the eligible-user list follows from it</w:t>
+            </w:r>
+          </w:p>
+        </w:tc>
+        <w:tc>
+          <w:tcPr/>
+          <w:p>
+            <w:pPr>
+              <w:pStyle w:val="Compact"/>
+              <w:jc w:val="left"/>
+            </w:pPr>
+            <w:r>
+              <w:t xml:space="preserve">Met</w:t>
+            </w:r>
+          </w:p>
+        </w:tc>
+      </w:tr>
+      <w:tr>
+        <w:tc>
+          <w:tcPr/>
+          <w:p>
+            <w:pPr>
+              <w:pStyle w:val="Compact"/>
+              <w:jc w:val="left"/>
+            </w:pPr>
+            <w:r>
+              <w:t xml:space="preserve">FR-33</w:t>
+            </w:r>
+          </w:p>
+        </w:tc>
+        <w:tc>
+          <w:tcPr/>
+          <w:p>
+            <w:pPr>
+              <w:pStyle w:val="Compact"/>
+              <w:jc w:val="left"/>
+            </w:pPr>
+            <w:r>
+              <w:t xml:space="preserve">An</w:t>
+            </w:r>
+            <w:r>
+              <w:t xml:space="preserve"> </w:t>
+            </w:r>
+            <w:r>
+              <w:rPr>
+                <w:bCs/>
+                <w:b/>
+              </w:rPr>
+              <w:t xml:space="preserve">All</w:t>
+            </w:r>
+            <w:r>
+              <w:t xml:space="preserve"> </w:t>
+            </w:r>
+            <w:r>
+              <w:t xml:space="preserve">checkbox selects the eligible users currently listed</w:t>
+            </w:r>
+          </w:p>
+        </w:tc>
+        <w:tc>
+          <w:tcPr/>
+          <w:p>
+            <w:pPr>
+              <w:pStyle w:val="Compact"/>
+              <w:jc w:val="left"/>
+            </w:pPr>
+            <w:r>
+              <w:t xml:space="preserve">Met</w:t>
+            </w:r>
+          </w:p>
+        </w:tc>
+      </w:tr>
+      <w:tr>
+        <w:tc>
+          <w:tcPr/>
+          <w:p>
+            <w:pPr>
+              <w:pStyle w:val="Compact"/>
+              <w:jc w:val="left"/>
+            </w:pPr>
+            <w:r>
+              <w:t xml:space="preserve">FR-34</w:t>
+            </w:r>
+          </w:p>
+        </w:tc>
+        <w:tc>
+          <w:tcPr/>
+          <w:p>
+            <w:pPr>
+              <w:pStyle w:val="Compact"/>
+              <w:jc w:val="left"/>
+            </w:pPr>
+            <w:r>
+              <w:t xml:space="preserve">Scheduled sends wait for</w:t>
+            </w:r>
+            <w:r>
+              <w:t xml:space="preserve"> </w:t>
+            </w:r>
+            <w:r>
+              <w:rPr>
+                <w:bCs/>
+                <w:b/>
+              </w:rPr>
+              <w:t xml:space="preserve">Tue-Thu mid-morning</w:t>
+            </w:r>
+            <w:r>
+              <w:t xml:space="preserve"> </w:t>
+            </w:r>
+            <w:r>
+              <w:t xml:space="preserve">in the recipient’s local time</w:t>
+            </w:r>
+          </w:p>
+        </w:tc>
+        <w:tc>
+          <w:tcPr/>
+          <w:p>
+            <w:pPr>
+              <w:pStyle w:val="Compact"/>
+              <w:jc w:val="left"/>
+            </w:pPr>
+            <w:r>
+              <w:t xml:space="preserve">Met</w:t>
+            </w:r>
+          </w:p>
+        </w:tc>
+      </w:tr>
     </w:tbl>
     <w:bookmarkStart w:id="21" w:name="business-rules-in-plain-terms"/>
     <w:p>
@@ -1634,13 +1895,44 @@
         <w:t xml:space="preserve"> </w:t>
       </w:r>
       <w:r>
-        <w:t xml:space="preserve">Once per 90 days per person across the whole portal, regardless of</w:t>
-      </w:r>
-      <w:r>
-        <w:t xml:space="preserve"> </w:t>
-      </w:r>
-      <w:r>
-        <w:t xml:space="preserve">which survey. The list shows exactly when someone becomes eligible again, for</w:t>
+        <w:t xml:space="preserve">Once per 90 days per person</w:t>
+      </w:r>
+      <w:r>
+        <w:t xml:space="preserve"> </w:t>
+      </w:r>
+      <w:r>
+        <w:rPr>
+          <w:bCs/>
+          <w:b/>
+        </w:rPr>
+        <w:t xml:space="preserve">per survey</w:t>
+      </w:r>
+      <w:r>
+        <w:t xml:space="preserve">. Somebody asked about</w:t>
+      </w:r>
+      <w:r>
+        <w:t xml:space="preserve"> </w:t>
+      </w:r>
+      <w:r>
+        <w:t xml:space="preserve">a complex resolution can still receive the scheduled relationship survey, but</w:t>
+      </w:r>
+      <w:r>
+        <w:t xml:space="preserve"> </w:t>
+      </w:r>
+      <w:r>
+        <w:t xml:space="preserve">not the same survey twice inside the window. Because of this, who can be</w:t>
+      </w:r>
+      <w:r>
+        <w:t xml:space="preserve"> </w:t>
+      </w:r>
+      <w:r>
+        <w:t xml:space="preserve">contacted depends on which survey is chosen, which is why the survey is picked</w:t>
+      </w:r>
+      <w:r>
+        <w:t xml:space="preserve"> </w:t>
+      </w:r>
+      <w:r>
+        <w:t xml:space="preserve">before the recipients. The list shows exactly when someone becomes eligible again, for</w:t>
       </w:r>
       <w:r>
         <w:t xml:space="preserve"> </w:t>
@@ -1922,7 +2214,7 @@
       </w:r>
     </w:p>
     <w:bookmarkEnd w:id="23"/>
-    <w:bookmarkStart w:id="32" w:name="test-report"/>
+    <w:bookmarkStart w:id="33" w:name="test-report"/>
     <w:p>
       <w:pPr>
         <w:pStyle w:val="Heading2"/>
@@ -4754,282 +5046,13 @@
       </w:r>
     </w:p>
     <w:bookmarkEnd w:id="29"/>
-    <w:bookmarkStart w:id="30" w:name="rules-proven-with-live-data"/>
+    <w:bookmarkStart w:id="30" w:name="X8a0b20d2101b64f3b84981d2cb329645a396068"/>
     <w:p>
       <w:pPr>
         <w:pStyle w:val="Heading3"/>
       </w:pPr>
       <w:r>
-        <w:t xml:space="preserve">4.3 Rules proven with live data</w:t>
-      </w:r>
-    </w:p>
-    <w:tbl>
-      <w:tblPr>
-        <w:tblStyle w:val="Table"/>
-        <w:tblW w:type="pct" w:w="5000"/>
-        <w:tblLook w:firstRow="1" w:lastRow="0" w:firstColumn="0" w:lastColumn="0" w:noHBand="0" w:noVBand="0" w:val="0020"/>
-        <w:jc w:val="start"/>
-      </w:tblPr>
-      <w:tblGrid>
-        <w:gridCol w:w="3960"/>
-        <w:gridCol w:w="3960"/>
-      </w:tblGrid>
-      <w:tr>
-        <w:trPr>
-          <w:tblHeader w:val="true"/>
-        </w:trPr>
-        <w:tc>
-          <w:tcPr/>
-          <w:p>
-            <w:pPr>
-              <w:pStyle w:val="Compact"/>
-              <w:jc w:val="left"/>
-            </w:pPr>
-            <w:r>
-              <w:t xml:space="preserve">Scenario</w:t>
-            </w:r>
-          </w:p>
-        </w:tc>
-        <w:tc>
-          <w:tcPr/>
-          <w:p>
-            <w:pPr>
-              <w:pStyle w:val="Compact"/>
-              <w:jc w:val="left"/>
-            </w:pPr>
-            <w:r>
-              <w:t xml:space="preserve">Result</w:t>
-            </w:r>
-          </w:p>
-        </w:tc>
-      </w:tr>
-      <w:tr>
-        <w:tc>
-          <w:tcPr/>
-          <w:p>
-            <w:pPr>
-              <w:pStyle w:val="Compact"/>
-              <w:jc w:val="left"/>
-            </w:pPr>
-            <w:r>
-              <w:t xml:space="preserve">First survey to a new recipient</w:t>
-            </w:r>
-          </w:p>
-        </w:tc>
-        <w:tc>
-          <w:tcPr/>
-          <w:p>
-            <w:pPr>
-              <w:pStyle w:val="Compact"/>
-              <w:jc w:val="left"/>
-            </w:pPr>
-            <w:r>
-              <w:t xml:space="preserve">Sent, assessment instance created, invitation queued</w:t>
-            </w:r>
-          </w:p>
-        </w:tc>
-      </w:tr>
-      <w:tr>
-        <w:tc>
-          <w:tcPr/>
-          <w:p>
-            <w:pPr>
-              <w:pStyle w:val="Compact"/>
-              <w:jc w:val="left"/>
-            </w:pPr>
-            <w:r>
-              <w:t xml:space="preserve">Same recipient again immediately</w:t>
-            </w:r>
-          </w:p>
-        </w:tc>
-        <w:tc>
-          <w:tcPr/>
-          <w:p>
-            <w:pPr>
-              <w:pStyle w:val="Compact"/>
-              <w:jc w:val="left"/>
-            </w:pPr>
-            <w:r>
-              <w:rPr>
-                <w:bCs/>
-                <w:b/>
-              </w:rPr>
-              <w:t xml:space="preserve">Blocked</w:t>
-            </w:r>
-            <w:r>
-              <w:t xml:space="preserve"> </w:t>
-            </w:r>
-            <w:r>
-              <w:t xml:space="preserve">—</w:t>
-            </w:r>
-            <w:r>
-              <w:t xml:space="preserve"> </w:t>
-            </w:r>
-            <w:r>
-              <w:t xml:space="preserve">“</w:t>
-            </w:r>
-            <w:r>
-              <w:t xml:space="preserve">Surveyed on 2026-08-01 09:13:50. Eligible again in 90 day(s).</w:t>
-            </w:r>
-            <w:r>
-              <w:t xml:space="preserve">”</w:t>
-            </w:r>
-          </w:p>
-        </w:tc>
-      </w:tr>
-      <w:tr>
-        <w:tc>
-          <w:tcPr/>
-          <w:p>
-            <w:pPr>
-              <w:pStyle w:val="Compact"/>
-              <w:jc w:val="left"/>
-            </w:pPr>
-            <w:r>
-              <w:t xml:space="preserve">Draft survey attempted</w:t>
-            </w:r>
-          </w:p>
-        </w:tc>
-        <w:tc>
-          <w:tcPr/>
-          <w:p>
-            <w:pPr>
-              <w:pStyle w:val="Compact"/>
-              <w:jc w:val="left"/>
-            </w:pPr>
-            <w:r>
-              <w:rPr>
-                <w:bCs/>
-                <w:b/>
-              </w:rPr>
-              <w:t xml:space="preserve">Blocked</w:t>
-            </w:r>
-            <w:r>
-              <w:t xml:space="preserve"> </w:t>
-            </w:r>
-            <w:r>
-              <w:t xml:space="preserve">—</w:t>
-            </w:r>
-            <w:r>
-              <w:t xml:space="preserve"> </w:t>
-            </w:r>
-            <w:r>
-              <w:t xml:space="preserve">“</w:t>
-            </w:r>
-            <w:r>
-              <w:t xml:space="preserve">Survey</w:t>
-            </w:r>
-            <w:r>
-              <w:t xml:space="preserve"> </w:t>
-            </w:r>
-            <w:r>
-              <w:t xml:space="preserve">‘</w:t>
-            </w:r>
-            <w:r>
-              <w:t xml:space="preserve">Managed Network Services Survey - Manual</w:t>
-            </w:r>
-            <w:r>
-              <w:t xml:space="preserve">’</w:t>
-            </w:r>
-            <w:r>
-              <w:t xml:space="preserve"> </w:t>
-            </w:r>
-            <w:r>
-              <w:t xml:space="preserve">is still in Draft. Publish it in Survey Designer before sending.</w:t>
-            </w:r>
-            <w:r>
-              <w:t xml:space="preserve">”</w:t>
-            </w:r>
-          </w:p>
-        </w:tc>
-      </w:tr>
-      <w:tr>
-        <w:tc>
-          <w:tcPr/>
-          <w:p>
-            <w:pPr>
-              <w:pStyle w:val="Compact"/>
-              <w:jc w:val="left"/>
-            </w:pPr>
-            <w:r>
-              <w:t xml:space="preserve">Published survey to a Primary User</w:t>
-            </w:r>
-          </w:p>
-        </w:tc>
-        <w:tc>
-          <w:tcPr/>
-          <w:p>
-            <w:pPr>
-              <w:pStyle w:val="Compact"/>
-              <w:jc w:val="left"/>
-            </w:pPr>
-            <w:r>
-              <w:t xml:space="preserve">Sent — instance created, invitation queued</w:t>
-            </w:r>
-          </w:p>
-        </w:tc>
-      </w:tr>
-      <w:tr>
-        <w:tc>
-          <w:tcPr/>
-          <w:p>
-            <w:pPr>
-              <w:pStyle w:val="Compact"/>
-              <w:jc w:val="left"/>
-            </w:pPr>
-            <w:r>
-              <w:t xml:space="preserve">Selecting 2 of 28 users</w:t>
-            </w:r>
-          </w:p>
-        </w:tc>
-        <w:tc>
-          <w:tcPr/>
-          <w:p>
-            <w:pPr>
-              <w:pStyle w:val="Compact"/>
-              <w:jc w:val="left"/>
-            </w:pPr>
-            <w:r>
-              <w:t xml:space="preserve">Exactly 2 recipients, confirmed in the audit table</w:t>
-            </w:r>
-          </w:p>
-        </w:tc>
-      </w:tr>
-      <w:tr>
-        <w:tc>
-          <w:tcPr/>
-          <w:p>
-            <w:pPr>
-              <w:pStyle w:val="Compact"/>
-              <w:jc w:val="left"/>
-            </w:pPr>
-            <w:r>
-              <w:t xml:space="preserve">Filtering the picker</w:t>
-            </w:r>
-          </w:p>
-        </w:tc>
-        <w:tc>
-          <w:tcPr/>
-          <w:p>
-            <w:pPr>
-              <w:pStyle w:val="Compact"/>
-              <w:jc w:val="left"/>
-            </w:pPr>
-            <w:r>
-              <w:t xml:space="preserve">28 narrowed to 1; only that person received it</w:t>
-            </w:r>
-          </w:p>
-        </w:tc>
-      </w:tr>
-    </w:tbl>
-    <w:bookmarkEnd w:id="30"/>
-    <w:bookmarkStart w:id="31" w:name="defects-found-and-resolved-during-build"/>
-    <w:p>
-      <w:pPr>
-        <w:pStyle w:val="Heading3"/>
-      </w:pPr>
-      <w:r>
-        <w:t xml:space="preserve">4.4 Defects found and resolved during build</w:t>
+        <w:t xml:space="preserve">4.2e Recipient selection and send timing — passed</w:t>
       </w:r>
     </w:p>
     <w:tbl>
@@ -5056,6 +5079,646 @@
               <w:jc w:val="left"/>
             </w:pPr>
             <w:r>
+              <w:t xml:space="preserve">Check</w:t>
+            </w:r>
+          </w:p>
+        </w:tc>
+        <w:tc>
+          <w:tcPr/>
+          <w:p>
+            <w:pPr>
+              <w:pStyle w:val="Compact"/>
+              <w:jc w:val="left"/>
+            </w:pPr>
+            <w:r>
+              <w:t xml:space="preserve">Covers</w:t>
+            </w:r>
+          </w:p>
+        </w:tc>
+        <w:tc>
+          <w:tcPr/>
+          <w:p>
+            <w:pPr>
+              <w:pStyle w:val="Compact"/>
+              <w:jc w:val="left"/>
+            </w:pPr>
+            <w:r>
+              <w:t xml:space="preserve">Observed</w:t>
+            </w:r>
+          </w:p>
+        </w:tc>
+      </w:tr>
+      <w:tr>
+        <w:tc>
+          <w:tcPr/>
+          <w:p>
+            <w:pPr>
+              <w:pStyle w:val="Compact"/>
+              <w:jc w:val="left"/>
+            </w:pPr>
+            <w:r>
+              <w:t xml:space="preserve">Both recipient types at once</w:t>
+            </w:r>
+          </w:p>
+        </w:tc>
+        <w:tc>
+          <w:tcPr/>
+          <w:p>
+            <w:pPr>
+              <w:pStyle w:val="Compact"/>
+              <w:jc w:val="left"/>
+            </w:pPr>
+            <w:r>
+              <w:t xml:space="preserve">FR-30</w:t>
+            </w:r>
+          </w:p>
+        </w:tc>
+        <w:tc>
+          <w:tcPr/>
+          <w:p>
+            <w:pPr>
+              <w:pStyle w:val="Compact"/>
+              <w:jc w:val="left"/>
+            </w:pPr>
+            <w:r>
+              <w:rPr>
+                <w:rStyle w:val="VerbatimChar"/>
+              </w:rPr>
+              <w:t xml:space="preserve">primary_user</w:t>
+            </w:r>
+            <w:r>
+              <w:t xml:space="preserve"> </w:t>
+            </w:r>
+            <w:r>
+              <w:t xml:space="preserve">-&gt; contact only;</w:t>
+            </w:r>
+            <w:r>
+              <w:t xml:space="preserve"> </w:t>
+            </w:r>
+            <w:r>
+              <w:rPr>
+                <w:rStyle w:val="VerbatimChar"/>
+              </w:rPr>
+              <w:t xml:space="preserve">selected_users</w:t>
+            </w:r>
+            <w:r>
+              <w:t xml:space="preserve"> </w:t>
+            </w:r>
+            <w:r>
+              <w:t xml:space="preserve">-&gt; the two chosen;</w:t>
+            </w:r>
+            <w:r>
+              <w:t xml:space="preserve"> </w:t>
+            </w:r>
+            <w:r>
+              <w:rPr>
+                <w:rStyle w:val="VerbatimChar"/>
+              </w:rPr>
+              <w:t xml:space="preserve">both</w:t>
+            </w:r>
+            <w:r>
+              <w:t xml:space="preserve"> </w:t>
+            </w:r>
+            <w:r>
+              <w:t xml:space="preserve">-&gt; all three, deduplicated</w:t>
+            </w:r>
+          </w:p>
+        </w:tc>
+      </w:tr>
+      <w:tr>
+        <w:tc>
+          <w:tcPr/>
+          <w:p>
+            <w:pPr>
+              <w:pStyle w:val="Compact"/>
+              <w:jc w:val="left"/>
+            </w:pPr>
+            <w:r>
+              <w:t xml:space="preserve">Window is per survey</w:t>
+            </w:r>
+          </w:p>
+        </w:tc>
+        <w:tc>
+          <w:tcPr/>
+          <w:p>
+            <w:pPr>
+              <w:pStyle w:val="Compact"/>
+              <w:jc w:val="left"/>
+            </w:pPr>
+            <w:r>
+              <w:t xml:space="preserve">FR-31</w:t>
+            </w:r>
+          </w:p>
+        </w:tc>
+        <w:tc>
+          <w:tcPr/>
+          <w:p>
+            <w:pPr>
+              <w:pStyle w:val="Compact"/>
+              <w:jc w:val="left"/>
+            </w:pPr>
+            <w:r>
+              <w:t xml:space="preserve">A recipient just sent the Automatic survey is blocked for it and still eligible for the Manual one</w:t>
+            </w:r>
+          </w:p>
+        </w:tc>
+      </w:tr>
+      <w:tr>
+        <w:tc>
+          <w:tcPr/>
+          <w:p>
+            <w:pPr>
+              <w:pStyle w:val="Compact"/>
+              <w:jc w:val="left"/>
+            </w:pPr>
+            <w:r>
+              <w:t xml:space="preserve">Eligible list follows the survey</w:t>
+            </w:r>
+          </w:p>
+        </w:tc>
+        <w:tc>
+          <w:tcPr/>
+          <w:p>
+            <w:pPr>
+              <w:pStyle w:val="Compact"/>
+              <w:jc w:val="left"/>
+            </w:pPr>
+            <w:r>
+              <w:t xml:space="preserve">FR-32</w:t>
+            </w:r>
+          </w:p>
+        </w:tc>
+        <w:tc>
+          <w:tcPr/>
+          <w:p>
+            <w:pPr>
+              <w:pStyle w:val="Compact"/>
+              <w:jc w:val="left"/>
+            </w:pPr>
+            <w:r>
+              <w:t xml:space="preserve">Same account returned 69 eligible / 8 blocked for Manual and 68 / 9 for Automatic</w:t>
+            </w:r>
+          </w:p>
+        </w:tc>
+      </w:tr>
+      <w:tr>
+        <w:tc>
+          <w:tcPr/>
+          <w:p>
+            <w:pPr>
+              <w:pStyle w:val="Compact"/>
+              <w:jc w:val="left"/>
+            </w:pPr>
+            <w:r>
+              <w:t xml:space="preserve">All checkbox</w:t>
+            </w:r>
+          </w:p>
+        </w:tc>
+        <w:tc>
+          <w:tcPr/>
+          <w:p>
+            <w:pPr>
+              <w:pStyle w:val="Compact"/>
+              <w:jc w:val="left"/>
+            </w:pPr>
+            <w:r>
+              <w:t xml:space="preserve">FR-33</w:t>
+            </w:r>
+          </w:p>
+        </w:tc>
+        <w:tc>
+          <w:tcPr/>
+          <w:p>
+            <w:pPr>
+              <w:pStyle w:val="Compact"/>
+              <w:jc w:val="left"/>
+            </w:pPr>
+            <w:r>
+              <w:t xml:space="preserve">Selects the eligible users currently listed, and respects the filter</w:t>
+            </w:r>
+          </w:p>
+        </w:tc>
+      </w:tr>
+      <w:tr>
+        <w:tc>
+          <w:tcPr/>
+          <w:p>
+            <w:pPr>
+              <w:pStyle w:val="Compact"/>
+              <w:jc w:val="left"/>
+            </w:pPr>
+            <w:r>
+              <w:t xml:space="preserve">Send window</w:t>
+            </w:r>
+          </w:p>
+        </w:tc>
+        <w:tc>
+          <w:tcPr/>
+          <w:p>
+            <w:pPr>
+              <w:pStyle w:val="Compact"/>
+              <w:jc w:val="left"/>
+            </w:pPr>
+            <w:r>
+              <w:t xml:space="preserve">FR-34</w:t>
+            </w:r>
+          </w:p>
+        </w:tc>
+        <w:tc>
+          <w:tcPr/>
+          <w:p>
+            <w:pPr>
+              <w:pStyle w:val="Compact"/>
+              <w:jc w:val="left"/>
+            </w:pPr>
+            <w:r>
+              <w:t xml:space="preserve">Mon, Fri, Sat, Sun held; Tue/Wed/Thu 09:00-11:00 local allowed; 07:00 and 12:00 held</w:t>
+            </w:r>
+          </w:p>
+        </w:tc>
+      </w:tr>
+      <w:tr>
+        <w:tc>
+          <w:tcPr/>
+          <w:p>
+            <w:pPr>
+              <w:pStyle w:val="Compact"/>
+              <w:jc w:val="left"/>
+            </w:pPr>
+            <w:r>
+              <w:t xml:space="preserve">Deferral</w:t>
+            </w:r>
+          </w:p>
+        </w:tc>
+        <w:tc>
+          <w:tcPr/>
+          <w:p>
+            <w:pPr>
+              <w:pStyle w:val="Compact"/>
+              <w:jc w:val="left"/>
+            </w:pPr>
+            <w:r>
+              <w:t xml:space="preserve">FR-34</w:t>
+            </w:r>
+          </w:p>
+        </w:tc>
+        <w:tc>
+          <w:tcPr/>
+          <w:p>
+            <w:pPr>
+              <w:pStyle w:val="Compact"/>
+              <w:jc w:val="left"/>
+            </w:pPr>
+            <w:r>
+              <w:t xml:space="preserve">Monday to Tue 09:00; Friday to the following Tue 09:00; Wednesday evening to Thu 09:00</w:t>
+            </w:r>
+          </w:p>
+        </w:tc>
+      </w:tr>
+    </w:tbl>
+    <w:p>
+      <w:pPr>
+        <w:pStyle w:val="BodyText"/>
+      </w:pPr>
+      <w:r>
+        <w:t xml:space="preserve">The runner moved from daily to hourly, since a daily job cannot land inside a</w:t>
+      </w:r>
+      <w:r>
+        <w:t xml:space="preserve"> </w:t>
+      </w:r>
+      <w:r>
+        <w:t xml:space="preserve">two-hour window.</w:t>
+      </w:r>
+    </w:p>
+    <w:p>
+      <w:pPr>
+        <w:pStyle w:val="BlockText"/>
+      </w:pPr>
+      <w:r>
+        <w:t xml:space="preserve">Only about 2% of user records carry a timezone, so in practice the window is</w:t>
+      </w:r>
+      <w:r>
+        <w:t xml:space="preserve"> </w:t>
+      </w:r>
+      <w:r>
+        <w:t xml:space="preserve">judged in the instance default (US/Eastern here). The recipient’s own</w:t>
+      </w:r>
+      <w:r>
+        <w:t xml:space="preserve"> </w:t>
+      </w:r>
+      <w:r>
+        <w:t xml:space="preserve">timezone is used wherever it is set. A request with recipients in different</w:t>
+      </w:r>
+      <w:r>
+        <w:t xml:space="preserve"> </w:t>
+      </w:r>
+      <w:r>
+        <w:t xml:space="preserve">timezones is judged in the first one found.</w:t>
+      </w:r>
+    </w:p>
+    <w:bookmarkEnd w:id="30"/>
+    <w:bookmarkStart w:id="31" w:name="rules-proven-with-live-data"/>
+    <w:p>
+      <w:pPr>
+        <w:pStyle w:val="Heading3"/>
+      </w:pPr>
+      <w:r>
+        <w:t xml:space="preserve">4.3 Rules proven with live data</w:t>
+      </w:r>
+    </w:p>
+    <w:tbl>
+      <w:tblPr>
+        <w:tblStyle w:val="Table"/>
+        <w:tblW w:type="pct" w:w="5000"/>
+        <w:tblLook w:firstRow="1" w:lastRow="0" w:firstColumn="0" w:lastColumn="0" w:noHBand="0" w:noVBand="0" w:val="0020"/>
+        <w:jc w:val="start"/>
+      </w:tblPr>
+      <w:tblGrid>
+        <w:gridCol w:w="3960"/>
+        <w:gridCol w:w="3960"/>
+      </w:tblGrid>
+      <w:tr>
+        <w:trPr>
+          <w:tblHeader w:val="true"/>
+        </w:trPr>
+        <w:tc>
+          <w:tcPr/>
+          <w:p>
+            <w:pPr>
+              <w:pStyle w:val="Compact"/>
+              <w:jc w:val="left"/>
+            </w:pPr>
+            <w:r>
+              <w:t xml:space="preserve">Scenario</w:t>
+            </w:r>
+          </w:p>
+        </w:tc>
+        <w:tc>
+          <w:tcPr/>
+          <w:p>
+            <w:pPr>
+              <w:pStyle w:val="Compact"/>
+              <w:jc w:val="left"/>
+            </w:pPr>
+            <w:r>
+              <w:t xml:space="preserve">Result</w:t>
+            </w:r>
+          </w:p>
+        </w:tc>
+      </w:tr>
+      <w:tr>
+        <w:tc>
+          <w:tcPr/>
+          <w:p>
+            <w:pPr>
+              <w:pStyle w:val="Compact"/>
+              <w:jc w:val="left"/>
+            </w:pPr>
+            <w:r>
+              <w:t xml:space="preserve">First survey to a new recipient</w:t>
+            </w:r>
+          </w:p>
+        </w:tc>
+        <w:tc>
+          <w:tcPr/>
+          <w:p>
+            <w:pPr>
+              <w:pStyle w:val="Compact"/>
+              <w:jc w:val="left"/>
+            </w:pPr>
+            <w:r>
+              <w:t xml:space="preserve">Sent, assessment instance created, invitation queued</w:t>
+            </w:r>
+          </w:p>
+        </w:tc>
+      </w:tr>
+      <w:tr>
+        <w:tc>
+          <w:tcPr/>
+          <w:p>
+            <w:pPr>
+              <w:pStyle w:val="Compact"/>
+              <w:jc w:val="left"/>
+            </w:pPr>
+            <w:r>
+              <w:t xml:space="preserve">Same recipient again immediately</w:t>
+            </w:r>
+          </w:p>
+        </w:tc>
+        <w:tc>
+          <w:tcPr/>
+          <w:p>
+            <w:pPr>
+              <w:pStyle w:val="Compact"/>
+              <w:jc w:val="left"/>
+            </w:pPr>
+            <w:r>
+              <w:rPr>
+                <w:bCs/>
+                <w:b/>
+              </w:rPr>
+              <w:t xml:space="preserve">Blocked</w:t>
+            </w:r>
+            <w:r>
+              <w:t xml:space="preserve"> </w:t>
+            </w:r>
+            <w:r>
+              <w:t xml:space="preserve">—</w:t>
+            </w:r>
+            <w:r>
+              <w:t xml:space="preserve"> </w:t>
+            </w:r>
+            <w:r>
+              <w:t xml:space="preserve">“</w:t>
+            </w:r>
+            <w:r>
+              <w:t xml:space="preserve">Surveyed on 2026-08-01 09:13:50. Eligible again in 90 day(s).</w:t>
+            </w:r>
+            <w:r>
+              <w:t xml:space="preserve">”</w:t>
+            </w:r>
+          </w:p>
+        </w:tc>
+      </w:tr>
+      <w:tr>
+        <w:tc>
+          <w:tcPr/>
+          <w:p>
+            <w:pPr>
+              <w:pStyle w:val="Compact"/>
+              <w:jc w:val="left"/>
+            </w:pPr>
+            <w:r>
+              <w:t xml:space="preserve">Draft survey attempted</w:t>
+            </w:r>
+          </w:p>
+        </w:tc>
+        <w:tc>
+          <w:tcPr/>
+          <w:p>
+            <w:pPr>
+              <w:pStyle w:val="Compact"/>
+              <w:jc w:val="left"/>
+            </w:pPr>
+            <w:r>
+              <w:rPr>
+                <w:bCs/>
+                <w:b/>
+              </w:rPr>
+              <w:t xml:space="preserve">Blocked</w:t>
+            </w:r>
+            <w:r>
+              <w:t xml:space="preserve"> </w:t>
+            </w:r>
+            <w:r>
+              <w:t xml:space="preserve">—</w:t>
+            </w:r>
+            <w:r>
+              <w:t xml:space="preserve"> </w:t>
+            </w:r>
+            <w:r>
+              <w:t xml:space="preserve">“</w:t>
+            </w:r>
+            <w:r>
+              <w:t xml:space="preserve">Survey</w:t>
+            </w:r>
+            <w:r>
+              <w:t xml:space="preserve"> </w:t>
+            </w:r>
+            <w:r>
+              <w:t xml:space="preserve">‘</w:t>
+            </w:r>
+            <w:r>
+              <w:t xml:space="preserve">Managed Network Services Survey - Manual</w:t>
+            </w:r>
+            <w:r>
+              <w:t xml:space="preserve">’</w:t>
+            </w:r>
+            <w:r>
+              <w:t xml:space="preserve"> </w:t>
+            </w:r>
+            <w:r>
+              <w:t xml:space="preserve">is still in Draft. Publish it in Survey Designer before sending.</w:t>
+            </w:r>
+            <w:r>
+              <w:t xml:space="preserve">”</w:t>
+            </w:r>
+          </w:p>
+        </w:tc>
+      </w:tr>
+      <w:tr>
+        <w:tc>
+          <w:tcPr/>
+          <w:p>
+            <w:pPr>
+              <w:pStyle w:val="Compact"/>
+              <w:jc w:val="left"/>
+            </w:pPr>
+            <w:r>
+              <w:t xml:space="preserve">Published survey to a Primary User</w:t>
+            </w:r>
+          </w:p>
+        </w:tc>
+        <w:tc>
+          <w:tcPr/>
+          <w:p>
+            <w:pPr>
+              <w:pStyle w:val="Compact"/>
+              <w:jc w:val="left"/>
+            </w:pPr>
+            <w:r>
+              <w:t xml:space="preserve">Sent — instance created, invitation queued</w:t>
+            </w:r>
+          </w:p>
+        </w:tc>
+      </w:tr>
+      <w:tr>
+        <w:tc>
+          <w:tcPr/>
+          <w:p>
+            <w:pPr>
+              <w:pStyle w:val="Compact"/>
+              <w:jc w:val="left"/>
+            </w:pPr>
+            <w:r>
+              <w:t xml:space="preserve">Selecting 2 of 28 users</w:t>
+            </w:r>
+          </w:p>
+        </w:tc>
+        <w:tc>
+          <w:tcPr/>
+          <w:p>
+            <w:pPr>
+              <w:pStyle w:val="Compact"/>
+              <w:jc w:val="left"/>
+            </w:pPr>
+            <w:r>
+              <w:t xml:space="preserve">Exactly 2 recipients, confirmed in the audit table</w:t>
+            </w:r>
+          </w:p>
+        </w:tc>
+      </w:tr>
+      <w:tr>
+        <w:tc>
+          <w:tcPr/>
+          <w:p>
+            <w:pPr>
+              <w:pStyle w:val="Compact"/>
+              <w:jc w:val="left"/>
+            </w:pPr>
+            <w:r>
+              <w:t xml:space="preserve">Filtering the picker</w:t>
+            </w:r>
+          </w:p>
+        </w:tc>
+        <w:tc>
+          <w:tcPr/>
+          <w:p>
+            <w:pPr>
+              <w:pStyle w:val="Compact"/>
+              <w:jc w:val="left"/>
+            </w:pPr>
+            <w:r>
+              <w:t xml:space="preserve">28 narrowed to 1; only that person received it</w:t>
+            </w:r>
+          </w:p>
+        </w:tc>
+      </w:tr>
+    </w:tbl>
+    <w:bookmarkEnd w:id="31"/>
+    <w:bookmarkStart w:id="32" w:name="defects-found-and-resolved-during-build"/>
+    <w:p>
+      <w:pPr>
+        <w:pStyle w:val="Heading3"/>
+      </w:pPr>
+      <w:r>
+        <w:t xml:space="preserve">4.4 Defects found and resolved during build</w:t>
+      </w:r>
+    </w:p>
+    <w:tbl>
+      <w:tblPr>
+        <w:tblStyle w:val="Table"/>
+        <w:tblW w:type="pct" w:w="5000"/>
+        <w:tblLook w:firstRow="1" w:lastRow="0" w:firstColumn="0" w:lastColumn="0" w:noHBand="0" w:noVBand="0" w:val="0020"/>
+        <w:jc w:val="start"/>
+      </w:tblPr>
+      <w:tblGrid>
+        <w:gridCol w:w="2640"/>
+        <w:gridCol w:w="2640"/>
+        <w:gridCol w:w="2640"/>
+      </w:tblGrid>
+      <w:tr>
+        <w:trPr>
+          <w:tblHeader w:val="true"/>
+        </w:trPr>
+        <w:tc>
+          <w:tcPr/>
+          <w:p>
+            <w:pPr>
+              <w:pStyle w:val="Compact"/>
+              <w:jc w:val="left"/>
+            </w:pPr>
+            <w:r>
               <w:t xml:space="preserve">Issue</w:t>
             </w:r>
           </w:p>
@@ -5371,9 +6034,9 @@
         </w:pict>
       </w:r>
     </w:p>
-    <w:bookmarkEnd w:id="31"/>
     <w:bookmarkEnd w:id="32"/>
-    <w:bookmarkStart w:id="37" w:name="open-items-for-the-business"/>
+    <w:bookmarkEnd w:id="33"/>
+    <w:bookmarkStart w:id="38" w:name="open-items-for-the-business"/>
     <w:p>
       <w:pPr>
         <w:pStyle w:val="Heading2"/>
@@ -5382,7 +6045,7 @@
         <w:t xml:space="preserve">5. Open items for the business</w:t>
       </w:r>
     </w:p>
-    <w:bookmarkStart w:id="33" w:name="email-delivery-is-switched-off"/>
+    <w:bookmarkStart w:id="34" w:name="email-delivery-is-switched-off"/>
     <w:p>
       <w:pPr>
         <w:pStyle w:val="Heading3"/>
@@ -5479,8 +6142,8 @@
         <w:t xml:space="preserve">, but no email arrives.</w:t>
       </w:r>
     </w:p>
-    <w:bookmarkEnd w:id="33"/>
-    <w:bookmarkStart w:id="34" w:name="survey-content-is-not-ready"/>
+    <w:bookmarkEnd w:id="34"/>
+    <w:bookmarkStart w:id="35" w:name="survey-content-is-not-ready"/>
     <w:p>
       <w:pPr>
         <w:pStyle w:val="Heading3"/>
@@ -5711,8 +6374,8 @@
         <w:t xml:space="preserve">survey owner to complete and publish the two outstanding surveys.</w:t>
       </w:r>
     </w:p>
-    <w:bookmarkEnd w:id="34"/>
-    <w:bookmarkStart w:id="35" w:name="X39aa0619141a19cc8d93bd47586e0ff2b27a037"/>
+    <w:bookmarkEnd w:id="35"/>
+    <w:bookmarkStart w:id="36" w:name="X39aa0619141a19cc8d93bd47586e0ff2b27a037"/>
     <w:p>
       <w:pPr>
         <w:pStyle w:val="Heading3"/>
@@ -5795,8 +6458,8 @@
         <w:t xml:space="preserve">would remove that fragility.</w:t>
       </w:r>
     </w:p>
-    <w:bookmarkEnd w:id="35"/>
-    <w:bookmarkStart w:id="36" w:name="sending-is-synchronous"/>
+    <w:bookmarkEnd w:id="36"/>
+    <w:bookmarkStart w:id="37" w:name="sending-is-synchronous"/>
     <w:p>
       <w:pPr>
         <w:pStyle w:val="Heading3"/>
@@ -5832,9 +6495,9 @@
         </w:pict>
       </w:r>
     </w:p>
-    <w:bookmarkEnd w:id="36"/>
     <w:bookmarkEnd w:id="37"/>
-    <w:bookmarkStart w:id="38" w:name="migration"/>
+    <w:bookmarkEnd w:id="38"/>
+    <w:bookmarkStart w:id="39" w:name="migration"/>
     <w:p>
       <w:pPr>
         <w:pStyle w:val="Heading2"/>
@@ -5944,8 +6607,8 @@
         </w:pict>
       </w:r>
     </w:p>
-    <w:bookmarkEnd w:id="38"/>
-    <w:bookmarkStart w:id="39" w:name="recommendation"/>
+    <w:bookmarkEnd w:id="39"/>
+    <w:bookmarkStart w:id="40" w:name="recommendation"/>
     <w:p>
       <w:pPr>
         <w:pStyle w:val="Heading2"/>
@@ -6043,8 +6706,8 @@
         <w:t xml:space="preserve">can be validated with genuine recipients.</w:t>
       </w:r>
     </w:p>
-    <w:bookmarkEnd w:id="39"/>
     <w:bookmarkEnd w:id="40"/>
+    <w:bookmarkEnd w:id="41"/>
     <w:sectPr/>
   </w:body>
 </w:document>

</xml_diff>

<commit_message>
Document the IEM escalation copy
Co-authored-by: paladuguraj <paladuguraj@users.noreply.github.com>
</commit_message>
<xml_diff>
--- a/docs/CSAT Survey Portal - Functional Requirements and Test Report.docx
+++ b/docs/CSAT Survey Portal - Functional Requirements and Test Report.docx
@@ -28,7 +28,7 @@
         </w:p>
       </w:sdtContent>
     </w:sdt>
-    <w:bookmarkStart w:id="41" w:name="X5b5e0d4201f25ea5647317961a6b8e350744058"/>
+    <w:bookmarkStart w:id="42" w:name="X5b5e0d4201f25ea5647317961a6b8e350744058"/>
     <w:p>
       <w:pPr>
         <w:pStyle w:val="Heading1"/>
@@ -1840,6 +1840,92 @@
           </w:p>
         </w:tc>
       </w:tr>
+      <w:tr>
+        <w:tc>
+          <w:tcPr/>
+          <w:p>
+            <w:pPr>
+              <w:pStyle w:val="Compact"/>
+              <w:jc w:val="left"/>
+            </w:pPr>
+            <w:r>
+              <w:t xml:space="preserve">FR-35</w:t>
+            </w:r>
+          </w:p>
+        </w:tc>
+        <w:tc>
+          <w:tcPr/>
+          <w:p>
+            <w:pPr>
+              <w:pStyle w:val="Compact"/>
+              <w:jc w:val="left"/>
+            </w:pPr>
+            <w:r>
+              <w:t xml:space="preserve">Every survey invitation copies the</w:t>
+            </w:r>
+            <w:r>
+              <w:t xml:space="preserve"> </w:t>
+            </w:r>
+            <w:r>
+              <w:rPr>
+                <w:bCs/>
+                <w:b/>
+              </w:rPr>
+              <w:t xml:space="preserve">IEM escalation mailbox</w:t>
+            </w:r>
+          </w:p>
+        </w:tc>
+        <w:tc>
+          <w:tcPr/>
+          <w:p>
+            <w:pPr>
+              <w:pStyle w:val="Compact"/>
+              <w:jc w:val="left"/>
+            </w:pPr>
+            <w:r>
+              <w:t xml:space="preserve">Met</w:t>
+            </w:r>
+          </w:p>
+        </w:tc>
+      </w:tr>
+      <w:tr>
+        <w:tc>
+          <w:tcPr/>
+          <w:p>
+            <w:pPr>
+              <w:pStyle w:val="Compact"/>
+              <w:jc w:val="left"/>
+            </w:pPr>
+            <w:r>
+              <w:t xml:space="preserve">FR-36</w:t>
+            </w:r>
+          </w:p>
+        </w:tc>
+        <w:tc>
+          <w:tcPr/>
+          <w:p>
+            <w:pPr>
+              <w:pStyle w:val="Compact"/>
+              <w:jc w:val="left"/>
+            </w:pPr>
+            <w:r>
+              <w:t xml:space="preserve">The copied address is configurable, and can be switched off, without a deploy</w:t>
+            </w:r>
+          </w:p>
+        </w:tc>
+        <w:tc>
+          <w:tcPr/>
+          <w:p>
+            <w:pPr>
+              <w:pStyle w:val="Compact"/>
+              <w:jc w:val="left"/>
+            </w:pPr>
+            <w:r>
+              <w:t xml:space="preserve">Met</w:t>
+            </w:r>
+          </w:p>
+        </w:tc>
+      </w:tr>
     </w:tbl>
     <w:bookmarkStart w:id="21" w:name="business-rules-in-plain-terms"/>
     <w:p>
@@ -2214,7 +2300,7 @@
       </w:r>
     </w:p>
     <w:bookmarkEnd w:id="23"/>
-    <w:bookmarkStart w:id="33" w:name="test-report"/>
+    <w:bookmarkStart w:id="34" w:name="test-report"/>
     <w:p>
       <w:pPr>
         <w:pStyle w:val="Heading2"/>
@@ -5417,282 +5503,13 @@
       </w:r>
     </w:p>
     <w:bookmarkEnd w:id="30"/>
-    <w:bookmarkStart w:id="31" w:name="rules-proven-with-live-data"/>
+    <w:bookmarkStart w:id="31" w:name="f-iem-escalation-copy-passed"/>
     <w:p>
       <w:pPr>
         <w:pStyle w:val="Heading3"/>
       </w:pPr>
       <w:r>
-        <w:t xml:space="preserve">4.3 Rules proven with live data</w:t>
-      </w:r>
-    </w:p>
-    <w:tbl>
-      <w:tblPr>
-        <w:tblStyle w:val="Table"/>
-        <w:tblW w:type="pct" w:w="5000"/>
-        <w:tblLook w:firstRow="1" w:lastRow="0" w:firstColumn="0" w:lastColumn="0" w:noHBand="0" w:noVBand="0" w:val="0020"/>
-        <w:jc w:val="start"/>
-      </w:tblPr>
-      <w:tblGrid>
-        <w:gridCol w:w="3960"/>
-        <w:gridCol w:w="3960"/>
-      </w:tblGrid>
-      <w:tr>
-        <w:trPr>
-          <w:tblHeader w:val="true"/>
-        </w:trPr>
-        <w:tc>
-          <w:tcPr/>
-          <w:p>
-            <w:pPr>
-              <w:pStyle w:val="Compact"/>
-              <w:jc w:val="left"/>
-            </w:pPr>
-            <w:r>
-              <w:t xml:space="preserve">Scenario</w:t>
-            </w:r>
-          </w:p>
-        </w:tc>
-        <w:tc>
-          <w:tcPr/>
-          <w:p>
-            <w:pPr>
-              <w:pStyle w:val="Compact"/>
-              <w:jc w:val="left"/>
-            </w:pPr>
-            <w:r>
-              <w:t xml:space="preserve">Result</w:t>
-            </w:r>
-          </w:p>
-        </w:tc>
-      </w:tr>
-      <w:tr>
-        <w:tc>
-          <w:tcPr/>
-          <w:p>
-            <w:pPr>
-              <w:pStyle w:val="Compact"/>
-              <w:jc w:val="left"/>
-            </w:pPr>
-            <w:r>
-              <w:t xml:space="preserve">First survey to a new recipient</w:t>
-            </w:r>
-          </w:p>
-        </w:tc>
-        <w:tc>
-          <w:tcPr/>
-          <w:p>
-            <w:pPr>
-              <w:pStyle w:val="Compact"/>
-              <w:jc w:val="left"/>
-            </w:pPr>
-            <w:r>
-              <w:t xml:space="preserve">Sent, assessment instance created, invitation queued</w:t>
-            </w:r>
-          </w:p>
-        </w:tc>
-      </w:tr>
-      <w:tr>
-        <w:tc>
-          <w:tcPr/>
-          <w:p>
-            <w:pPr>
-              <w:pStyle w:val="Compact"/>
-              <w:jc w:val="left"/>
-            </w:pPr>
-            <w:r>
-              <w:t xml:space="preserve">Same recipient again immediately</w:t>
-            </w:r>
-          </w:p>
-        </w:tc>
-        <w:tc>
-          <w:tcPr/>
-          <w:p>
-            <w:pPr>
-              <w:pStyle w:val="Compact"/>
-              <w:jc w:val="left"/>
-            </w:pPr>
-            <w:r>
-              <w:rPr>
-                <w:bCs/>
-                <w:b/>
-              </w:rPr>
-              <w:t xml:space="preserve">Blocked</w:t>
-            </w:r>
-            <w:r>
-              <w:t xml:space="preserve"> </w:t>
-            </w:r>
-            <w:r>
-              <w:t xml:space="preserve">—</w:t>
-            </w:r>
-            <w:r>
-              <w:t xml:space="preserve"> </w:t>
-            </w:r>
-            <w:r>
-              <w:t xml:space="preserve">“</w:t>
-            </w:r>
-            <w:r>
-              <w:t xml:space="preserve">Surveyed on 2026-08-01 09:13:50. Eligible again in 90 day(s).</w:t>
-            </w:r>
-            <w:r>
-              <w:t xml:space="preserve">”</w:t>
-            </w:r>
-          </w:p>
-        </w:tc>
-      </w:tr>
-      <w:tr>
-        <w:tc>
-          <w:tcPr/>
-          <w:p>
-            <w:pPr>
-              <w:pStyle w:val="Compact"/>
-              <w:jc w:val="left"/>
-            </w:pPr>
-            <w:r>
-              <w:t xml:space="preserve">Draft survey attempted</w:t>
-            </w:r>
-          </w:p>
-        </w:tc>
-        <w:tc>
-          <w:tcPr/>
-          <w:p>
-            <w:pPr>
-              <w:pStyle w:val="Compact"/>
-              <w:jc w:val="left"/>
-            </w:pPr>
-            <w:r>
-              <w:rPr>
-                <w:bCs/>
-                <w:b/>
-              </w:rPr>
-              <w:t xml:space="preserve">Blocked</w:t>
-            </w:r>
-            <w:r>
-              <w:t xml:space="preserve"> </w:t>
-            </w:r>
-            <w:r>
-              <w:t xml:space="preserve">—</w:t>
-            </w:r>
-            <w:r>
-              <w:t xml:space="preserve"> </w:t>
-            </w:r>
-            <w:r>
-              <w:t xml:space="preserve">“</w:t>
-            </w:r>
-            <w:r>
-              <w:t xml:space="preserve">Survey</w:t>
-            </w:r>
-            <w:r>
-              <w:t xml:space="preserve"> </w:t>
-            </w:r>
-            <w:r>
-              <w:t xml:space="preserve">‘</w:t>
-            </w:r>
-            <w:r>
-              <w:t xml:space="preserve">Managed Network Services Survey - Manual</w:t>
-            </w:r>
-            <w:r>
-              <w:t xml:space="preserve">’</w:t>
-            </w:r>
-            <w:r>
-              <w:t xml:space="preserve"> </w:t>
-            </w:r>
-            <w:r>
-              <w:t xml:space="preserve">is still in Draft. Publish it in Survey Designer before sending.</w:t>
-            </w:r>
-            <w:r>
-              <w:t xml:space="preserve">”</w:t>
-            </w:r>
-          </w:p>
-        </w:tc>
-      </w:tr>
-      <w:tr>
-        <w:tc>
-          <w:tcPr/>
-          <w:p>
-            <w:pPr>
-              <w:pStyle w:val="Compact"/>
-              <w:jc w:val="left"/>
-            </w:pPr>
-            <w:r>
-              <w:t xml:space="preserve">Published survey to a Primary User</w:t>
-            </w:r>
-          </w:p>
-        </w:tc>
-        <w:tc>
-          <w:tcPr/>
-          <w:p>
-            <w:pPr>
-              <w:pStyle w:val="Compact"/>
-              <w:jc w:val="left"/>
-            </w:pPr>
-            <w:r>
-              <w:t xml:space="preserve">Sent — instance created, invitation queued</w:t>
-            </w:r>
-          </w:p>
-        </w:tc>
-      </w:tr>
-      <w:tr>
-        <w:tc>
-          <w:tcPr/>
-          <w:p>
-            <w:pPr>
-              <w:pStyle w:val="Compact"/>
-              <w:jc w:val="left"/>
-            </w:pPr>
-            <w:r>
-              <w:t xml:space="preserve">Selecting 2 of 28 users</w:t>
-            </w:r>
-          </w:p>
-        </w:tc>
-        <w:tc>
-          <w:tcPr/>
-          <w:p>
-            <w:pPr>
-              <w:pStyle w:val="Compact"/>
-              <w:jc w:val="left"/>
-            </w:pPr>
-            <w:r>
-              <w:t xml:space="preserve">Exactly 2 recipients, confirmed in the audit table</w:t>
-            </w:r>
-          </w:p>
-        </w:tc>
-      </w:tr>
-      <w:tr>
-        <w:tc>
-          <w:tcPr/>
-          <w:p>
-            <w:pPr>
-              <w:pStyle w:val="Compact"/>
-              <w:jc w:val="left"/>
-            </w:pPr>
-            <w:r>
-              <w:t xml:space="preserve">Filtering the picker</w:t>
-            </w:r>
-          </w:p>
-        </w:tc>
-        <w:tc>
-          <w:tcPr/>
-          <w:p>
-            <w:pPr>
-              <w:pStyle w:val="Compact"/>
-              <w:jc w:val="left"/>
-            </w:pPr>
-            <w:r>
-              <w:t xml:space="preserve">28 narrowed to 1; only that person received it</w:t>
-            </w:r>
-          </w:p>
-        </w:tc>
-      </w:tr>
-    </w:tbl>
-    <w:bookmarkEnd w:id="31"/>
-    <w:bookmarkStart w:id="32" w:name="defects-found-and-resolved-during-build"/>
-    <w:p>
-      <w:pPr>
-        <w:pStyle w:val="Heading3"/>
-      </w:pPr>
-      <w:r>
-        <w:t xml:space="preserve">4.4 Defects found and resolved during build</w:t>
+        <w:t xml:space="preserve">4.2f IEM escalation copy — passed</w:t>
       </w:r>
     </w:p>
     <w:tbl>
@@ -5719,6 +5536,512 @@
               <w:jc w:val="left"/>
             </w:pPr>
             <w:r>
+              <w:t xml:space="preserve">Check</w:t>
+            </w:r>
+          </w:p>
+        </w:tc>
+        <w:tc>
+          <w:tcPr/>
+          <w:p>
+            <w:pPr>
+              <w:pStyle w:val="Compact"/>
+              <w:jc w:val="left"/>
+            </w:pPr>
+            <w:r>
+              <w:t xml:space="preserve">Covers</w:t>
+            </w:r>
+          </w:p>
+        </w:tc>
+        <w:tc>
+          <w:tcPr/>
+          <w:p>
+            <w:pPr>
+              <w:pStyle w:val="Compact"/>
+              <w:jc w:val="left"/>
+            </w:pPr>
+            <w:r>
+              <w:t xml:space="preserve">Observed</w:t>
+            </w:r>
+          </w:p>
+        </w:tc>
+      </w:tr>
+      <w:tr>
+        <w:tc>
+          <w:tcPr/>
+          <w:p>
+            <w:pPr>
+              <w:pStyle w:val="Compact"/>
+              <w:jc w:val="left"/>
+            </w:pPr>
+            <w:r>
+              <w:t xml:space="preserve">Copy applied</w:t>
+            </w:r>
+          </w:p>
+        </w:tc>
+        <w:tc>
+          <w:tcPr/>
+          <w:p>
+            <w:pPr>
+              <w:pStyle w:val="Compact"/>
+              <w:jc w:val="left"/>
+            </w:pPr>
+            <w:r>
+              <w:t xml:space="preserve">FR-35</w:t>
+            </w:r>
+          </w:p>
+        </w:tc>
+        <w:tc>
+          <w:tcPr/>
+          <w:p>
+            <w:pPr>
+              <w:pStyle w:val="Compact"/>
+              <w:jc w:val="left"/>
+            </w:pPr>
+            <w:r>
+              <w:t xml:space="preserve">A generated invitation shows</w:t>
+            </w:r>
+            <w:r>
+              <w:t xml:space="preserve"> </w:t>
+            </w:r>
+            <w:r>
+              <w:rPr>
+                <w:rStyle w:val="VerbatimChar"/>
+              </w:rPr>
+              <w:t xml:space="preserve">CC: iem_escalation@appdirect.com</w:t>
+            </w:r>
+          </w:p>
+        </w:tc>
+      </w:tr>
+      <w:tr>
+        <w:tc>
+          <w:tcPr/>
+          <w:p>
+            <w:pPr>
+              <w:pStyle w:val="Compact"/>
+              <w:jc w:val="left"/>
+            </w:pPr>
+            <w:r>
+              <w:t xml:space="preserve">Body unchanged</w:t>
+            </w:r>
+          </w:p>
+        </w:tc>
+        <w:tc>
+          <w:tcPr/>
+          <w:p>
+            <w:pPr>
+              <w:pStyle w:val="Compact"/>
+              <w:jc w:val="left"/>
+            </w:pPr>
+            <w:r>
+              <w:t xml:space="preserve">FR-35</w:t>
+            </w:r>
+          </w:p>
+        </w:tc>
+        <w:tc>
+          <w:tcPr/>
+          <w:p>
+            <w:pPr>
+              <w:pStyle w:val="Compact"/>
+              <w:jc w:val="left"/>
+            </w:pPr>
+            <w:r>
+              <w:t xml:space="preserve">The mail script prints nothing</w:t>
+            </w:r>
+          </w:p>
+        </w:tc>
+      </w:tr>
+      <w:tr>
+        <w:tc>
+          <w:tcPr/>
+          <w:p>
+            <w:pPr>
+              <w:pStyle w:val="Compact"/>
+              <w:jc w:val="left"/>
+            </w:pPr>
+            <w:r>
+              <w:t xml:space="preserve">Configurable</w:t>
+            </w:r>
+          </w:p>
+        </w:tc>
+        <w:tc>
+          <w:tcPr/>
+          <w:p>
+            <w:pPr>
+              <w:pStyle w:val="Compact"/>
+              <w:jc w:val="left"/>
+            </w:pPr>
+            <w:r>
+              <w:t xml:space="preserve">FR-36</w:t>
+            </w:r>
+          </w:p>
+        </w:tc>
+        <w:tc>
+          <w:tcPr/>
+          <w:p>
+            <w:pPr>
+              <w:pStyle w:val="Compact"/>
+              <w:jc w:val="left"/>
+            </w:pPr>
+            <w:r>
+              <w:t xml:space="preserve">Address read from</w:t>
+            </w:r>
+            <w:r>
+              <w:t xml:space="preserve"> </w:t>
+            </w:r>
+            <w:r>
+              <w:rPr>
+                <w:rStyle w:val="VerbatimChar"/>
+              </w:rPr>
+              <w:t xml:space="preserve">csat.iem.cc_email</w:t>
+            </w:r>
+            <w:r>
+              <w:t xml:space="preserve">; clearing it adds no copy</w:t>
+            </w:r>
+          </w:p>
+        </w:tc>
+      </w:tr>
+      <w:tr>
+        <w:tc>
+          <w:tcPr/>
+          <w:p>
+            <w:pPr>
+              <w:pStyle w:val="Compact"/>
+              <w:jc w:val="left"/>
+            </w:pPr>
+            <w:r>
+              <w:t xml:space="preserve">Not overwritten</w:t>
+            </w:r>
+          </w:p>
+        </w:tc>
+        <w:tc>
+          <w:tcPr/>
+          <w:p>
+            <w:pPr>
+              <w:pStyle w:val="Compact"/>
+              <w:jc w:val="left"/>
+            </w:pPr>
+            <w:r>
+              <w:t xml:space="preserve">FR-36</w:t>
+            </w:r>
+          </w:p>
+        </w:tc>
+        <w:tc>
+          <w:tcPr/>
+          <w:p>
+            <w:pPr>
+              <w:pStyle w:val="Compact"/>
+              <w:jc w:val="left"/>
+            </w:pPr>
+            <w:r>
+              <w:t xml:space="preserve">The deploy seeds the property only when it is absent</w:t>
+            </w:r>
+          </w:p>
+        </w:tc>
+      </w:tr>
+    </w:tbl>
+    <w:bookmarkEnd w:id="31"/>
+    <w:bookmarkStart w:id="32" w:name="rules-proven-with-live-data"/>
+    <w:p>
+      <w:pPr>
+        <w:pStyle w:val="Heading3"/>
+      </w:pPr>
+      <w:r>
+        <w:t xml:space="preserve">4.3 Rules proven with live data</w:t>
+      </w:r>
+    </w:p>
+    <w:tbl>
+      <w:tblPr>
+        <w:tblStyle w:val="Table"/>
+        <w:tblW w:type="pct" w:w="5000"/>
+        <w:tblLook w:firstRow="1" w:lastRow="0" w:firstColumn="0" w:lastColumn="0" w:noHBand="0" w:noVBand="0" w:val="0020"/>
+        <w:jc w:val="start"/>
+      </w:tblPr>
+      <w:tblGrid>
+        <w:gridCol w:w="3960"/>
+        <w:gridCol w:w="3960"/>
+      </w:tblGrid>
+      <w:tr>
+        <w:trPr>
+          <w:tblHeader w:val="true"/>
+        </w:trPr>
+        <w:tc>
+          <w:tcPr/>
+          <w:p>
+            <w:pPr>
+              <w:pStyle w:val="Compact"/>
+              <w:jc w:val="left"/>
+            </w:pPr>
+            <w:r>
+              <w:t xml:space="preserve">Scenario</w:t>
+            </w:r>
+          </w:p>
+        </w:tc>
+        <w:tc>
+          <w:tcPr/>
+          <w:p>
+            <w:pPr>
+              <w:pStyle w:val="Compact"/>
+              <w:jc w:val="left"/>
+            </w:pPr>
+            <w:r>
+              <w:t xml:space="preserve">Result</w:t>
+            </w:r>
+          </w:p>
+        </w:tc>
+      </w:tr>
+      <w:tr>
+        <w:tc>
+          <w:tcPr/>
+          <w:p>
+            <w:pPr>
+              <w:pStyle w:val="Compact"/>
+              <w:jc w:val="left"/>
+            </w:pPr>
+            <w:r>
+              <w:t xml:space="preserve">First survey to a new recipient</w:t>
+            </w:r>
+          </w:p>
+        </w:tc>
+        <w:tc>
+          <w:tcPr/>
+          <w:p>
+            <w:pPr>
+              <w:pStyle w:val="Compact"/>
+              <w:jc w:val="left"/>
+            </w:pPr>
+            <w:r>
+              <w:t xml:space="preserve">Sent, assessment instance created, invitation queued</w:t>
+            </w:r>
+          </w:p>
+        </w:tc>
+      </w:tr>
+      <w:tr>
+        <w:tc>
+          <w:tcPr/>
+          <w:p>
+            <w:pPr>
+              <w:pStyle w:val="Compact"/>
+              <w:jc w:val="left"/>
+            </w:pPr>
+            <w:r>
+              <w:t xml:space="preserve">Same recipient again immediately</w:t>
+            </w:r>
+          </w:p>
+        </w:tc>
+        <w:tc>
+          <w:tcPr/>
+          <w:p>
+            <w:pPr>
+              <w:pStyle w:val="Compact"/>
+              <w:jc w:val="left"/>
+            </w:pPr>
+            <w:r>
+              <w:rPr>
+                <w:bCs/>
+                <w:b/>
+              </w:rPr>
+              <w:t xml:space="preserve">Blocked</w:t>
+            </w:r>
+            <w:r>
+              <w:t xml:space="preserve"> </w:t>
+            </w:r>
+            <w:r>
+              <w:t xml:space="preserve">—</w:t>
+            </w:r>
+            <w:r>
+              <w:t xml:space="preserve"> </w:t>
+            </w:r>
+            <w:r>
+              <w:t xml:space="preserve">“</w:t>
+            </w:r>
+            <w:r>
+              <w:t xml:space="preserve">Surveyed on 2026-08-01 09:13:50. Eligible again in 90 day(s).</w:t>
+            </w:r>
+            <w:r>
+              <w:t xml:space="preserve">”</w:t>
+            </w:r>
+          </w:p>
+        </w:tc>
+      </w:tr>
+      <w:tr>
+        <w:tc>
+          <w:tcPr/>
+          <w:p>
+            <w:pPr>
+              <w:pStyle w:val="Compact"/>
+              <w:jc w:val="left"/>
+            </w:pPr>
+            <w:r>
+              <w:t xml:space="preserve">Draft survey attempted</w:t>
+            </w:r>
+          </w:p>
+        </w:tc>
+        <w:tc>
+          <w:tcPr/>
+          <w:p>
+            <w:pPr>
+              <w:pStyle w:val="Compact"/>
+              <w:jc w:val="left"/>
+            </w:pPr>
+            <w:r>
+              <w:rPr>
+                <w:bCs/>
+                <w:b/>
+              </w:rPr>
+              <w:t xml:space="preserve">Blocked</w:t>
+            </w:r>
+            <w:r>
+              <w:t xml:space="preserve"> </w:t>
+            </w:r>
+            <w:r>
+              <w:t xml:space="preserve">—</w:t>
+            </w:r>
+            <w:r>
+              <w:t xml:space="preserve"> </w:t>
+            </w:r>
+            <w:r>
+              <w:t xml:space="preserve">“</w:t>
+            </w:r>
+            <w:r>
+              <w:t xml:space="preserve">Survey</w:t>
+            </w:r>
+            <w:r>
+              <w:t xml:space="preserve"> </w:t>
+            </w:r>
+            <w:r>
+              <w:t xml:space="preserve">‘</w:t>
+            </w:r>
+            <w:r>
+              <w:t xml:space="preserve">Managed Network Services Survey - Manual</w:t>
+            </w:r>
+            <w:r>
+              <w:t xml:space="preserve">’</w:t>
+            </w:r>
+            <w:r>
+              <w:t xml:space="preserve"> </w:t>
+            </w:r>
+            <w:r>
+              <w:t xml:space="preserve">is still in Draft. Publish it in Survey Designer before sending.</w:t>
+            </w:r>
+            <w:r>
+              <w:t xml:space="preserve">”</w:t>
+            </w:r>
+          </w:p>
+        </w:tc>
+      </w:tr>
+      <w:tr>
+        <w:tc>
+          <w:tcPr/>
+          <w:p>
+            <w:pPr>
+              <w:pStyle w:val="Compact"/>
+              <w:jc w:val="left"/>
+            </w:pPr>
+            <w:r>
+              <w:t xml:space="preserve">Published survey to a Primary User</w:t>
+            </w:r>
+          </w:p>
+        </w:tc>
+        <w:tc>
+          <w:tcPr/>
+          <w:p>
+            <w:pPr>
+              <w:pStyle w:val="Compact"/>
+              <w:jc w:val="left"/>
+            </w:pPr>
+            <w:r>
+              <w:t xml:space="preserve">Sent — instance created, invitation queued</w:t>
+            </w:r>
+          </w:p>
+        </w:tc>
+      </w:tr>
+      <w:tr>
+        <w:tc>
+          <w:tcPr/>
+          <w:p>
+            <w:pPr>
+              <w:pStyle w:val="Compact"/>
+              <w:jc w:val="left"/>
+            </w:pPr>
+            <w:r>
+              <w:t xml:space="preserve">Selecting 2 of 28 users</w:t>
+            </w:r>
+          </w:p>
+        </w:tc>
+        <w:tc>
+          <w:tcPr/>
+          <w:p>
+            <w:pPr>
+              <w:pStyle w:val="Compact"/>
+              <w:jc w:val="left"/>
+            </w:pPr>
+            <w:r>
+              <w:t xml:space="preserve">Exactly 2 recipients, confirmed in the audit table</w:t>
+            </w:r>
+          </w:p>
+        </w:tc>
+      </w:tr>
+      <w:tr>
+        <w:tc>
+          <w:tcPr/>
+          <w:p>
+            <w:pPr>
+              <w:pStyle w:val="Compact"/>
+              <w:jc w:val="left"/>
+            </w:pPr>
+            <w:r>
+              <w:t xml:space="preserve">Filtering the picker</w:t>
+            </w:r>
+          </w:p>
+        </w:tc>
+        <w:tc>
+          <w:tcPr/>
+          <w:p>
+            <w:pPr>
+              <w:pStyle w:val="Compact"/>
+              <w:jc w:val="left"/>
+            </w:pPr>
+            <w:r>
+              <w:t xml:space="preserve">28 narrowed to 1; only that person received it</w:t>
+            </w:r>
+          </w:p>
+        </w:tc>
+      </w:tr>
+    </w:tbl>
+    <w:bookmarkEnd w:id="32"/>
+    <w:bookmarkStart w:id="33" w:name="defects-found-and-resolved-during-build"/>
+    <w:p>
+      <w:pPr>
+        <w:pStyle w:val="Heading3"/>
+      </w:pPr>
+      <w:r>
+        <w:t xml:space="preserve">4.4 Defects found and resolved during build</w:t>
+      </w:r>
+    </w:p>
+    <w:tbl>
+      <w:tblPr>
+        <w:tblStyle w:val="Table"/>
+        <w:tblW w:type="pct" w:w="5000"/>
+        <w:tblLook w:firstRow="1" w:lastRow="0" w:firstColumn="0" w:lastColumn="0" w:noHBand="0" w:noVBand="0" w:val="0020"/>
+        <w:jc w:val="start"/>
+      </w:tblPr>
+      <w:tblGrid>
+        <w:gridCol w:w="2640"/>
+        <w:gridCol w:w="2640"/>
+        <w:gridCol w:w="2640"/>
+      </w:tblGrid>
+      <w:tr>
+        <w:trPr>
+          <w:tblHeader w:val="true"/>
+        </w:trPr>
+        <w:tc>
+          <w:tcPr/>
+          <w:p>
+            <w:pPr>
+              <w:pStyle w:val="Compact"/>
+              <w:jc w:val="left"/>
+            </w:pPr>
+            <w:r>
               <w:t xml:space="preserve">Issue</w:t>
             </w:r>
           </w:p>
@@ -6034,9 +6357,9 @@
         </w:pict>
       </w:r>
     </w:p>
-    <w:bookmarkEnd w:id="32"/>
     <w:bookmarkEnd w:id="33"/>
-    <w:bookmarkStart w:id="38" w:name="open-items-for-the-business"/>
+    <w:bookmarkEnd w:id="34"/>
+    <w:bookmarkStart w:id="39" w:name="open-items-for-the-business"/>
     <w:p>
       <w:pPr>
         <w:pStyle w:val="Heading2"/>
@@ -6045,7 +6368,7 @@
         <w:t xml:space="preserve">5. Open items for the business</w:t>
       </w:r>
     </w:p>
-    <w:bookmarkStart w:id="34" w:name="email-delivery-is-switched-off"/>
+    <w:bookmarkStart w:id="35" w:name="email-delivery-is-switched-off"/>
     <w:p>
       <w:pPr>
         <w:pStyle w:val="Heading3"/>
@@ -6142,8 +6465,8 @@
         <w:t xml:space="preserve">, but no email arrives.</w:t>
       </w:r>
     </w:p>
-    <w:bookmarkEnd w:id="34"/>
-    <w:bookmarkStart w:id="35" w:name="survey-content-is-not-ready"/>
+    <w:bookmarkEnd w:id="35"/>
+    <w:bookmarkStart w:id="36" w:name="survey-content-is-not-ready"/>
     <w:p>
       <w:pPr>
         <w:pStyle w:val="Heading3"/>
@@ -6374,8 +6697,8 @@
         <w:t xml:space="preserve">survey owner to complete and publish the two outstanding surveys.</w:t>
       </w:r>
     </w:p>
-    <w:bookmarkEnd w:id="35"/>
-    <w:bookmarkStart w:id="36" w:name="X39aa0619141a19cc8d93bd47586e0ff2b27a037"/>
+    <w:bookmarkEnd w:id="36"/>
+    <w:bookmarkStart w:id="37" w:name="X39aa0619141a19cc8d93bd47586e0ff2b27a037"/>
     <w:p>
       <w:pPr>
         <w:pStyle w:val="Heading3"/>
@@ -6458,8 +6781,8 @@
         <w:t xml:space="preserve">would remove that fragility.</w:t>
       </w:r>
     </w:p>
-    <w:bookmarkEnd w:id="36"/>
-    <w:bookmarkStart w:id="37" w:name="sending-is-synchronous"/>
+    <w:bookmarkEnd w:id="37"/>
+    <w:bookmarkStart w:id="38" w:name="sending-is-synchronous"/>
     <w:p>
       <w:pPr>
         <w:pStyle w:val="Heading3"/>
@@ -6495,9 +6818,9 @@
         </w:pict>
       </w:r>
     </w:p>
-    <w:bookmarkEnd w:id="37"/>
     <w:bookmarkEnd w:id="38"/>
-    <w:bookmarkStart w:id="39" w:name="migration"/>
+    <w:bookmarkEnd w:id="39"/>
+    <w:bookmarkStart w:id="40" w:name="migration"/>
     <w:p>
       <w:pPr>
         <w:pStyle w:val="Heading2"/>
@@ -6607,8 +6930,8 @@
         </w:pict>
       </w:r>
     </w:p>
-    <w:bookmarkEnd w:id="39"/>
-    <w:bookmarkStart w:id="40" w:name="recommendation"/>
+    <w:bookmarkEnd w:id="40"/>
+    <w:bookmarkStart w:id="41" w:name="recommendation"/>
     <w:p>
       <w:pPr>
         <w:pStyle w:val="Heading2"/>
@@ -6706,8 +7029,8 @@
         <w:t xml:space="preserve">can be validated with genuine recipients.</w:t>
       </w:r>
     </w:p>
-    <w:bookmarkEnd w:id="40"/>
     <w:bookmarkEnd w:id="41"/>
+    <w:bookmarkEnd w:id="42"/>
     <w:sectPr/>
   </w:body>
 </w:document>

</xml_diff>